<commit_message>
Update CPIPM project outline document and automation script
Replit-Commit-Author: Agent
</commit_message>
<xml_diff>
--- a/vtccp/references/CPIPM-Project-Outline-v1.1.docx
+++ b/vtccp/references/CPIPM-Project-Outline-v1.1.docx
@@ -169,7 +169,7 @@
       <w:tr>
         <w:trPr>
           <w:tblHeader/>
-          <w:trHeight w:val="432" w:hRule="atLeast"/>
+          <w:trHeight w:val="360" w:hRule="atLeast"/>
         </w:trPr>
         <w:tc>
           <w:tcPr>
@@ -232,7 +232,7 @@
       </w:tr>
       <w:tr>
         <w:trPr>
-          <w:trHeight w:val="432" w:hRule="atLeast"/>
+          <w:trHeight w:val="360" w:hRule="atLeast"/>
         </w:trPr>
         <w:tc>
           <w:tcPr>
@@ -293,7 +293,7 @@
       </w:tr>
       <w:tr>
         <w:trPr>
-          <w:trHeight w:val="432" w:hRule="atLeast"/>
+          <w:trHeight w:val="1080" w:hRule="atLeast"/>
         </w:trPr>
         <w:tc>
           <w:tcPr>
@@ -354,7 +354,7 @@
       </w:tr>
       <w:tr>
         <w:trPr>
-          <w:trHeight w:val="432" w:hRule="atLeast"/>
+          <w:trHeight w:val="360" w:hRule="atLeast"/>
         </w:trPr>
         <w:tc>
           <w:tcPr>
@@ -415,7 +415,7 @@
       </w:tr>
       <w:tr>
         <w:trPr>
-          <w:trHeight w:val="432" w:hRule="atLeast"/>
+          <w:trHeight w:val="1080" w:hRule="atLeast"/>
         </w:trPr>
         <w:tc>
           <w:tcPr>
@@ -476,7 +476,7 @@
       </w:tr>
       <w:tr>
         <w:trPr>
-          <w:trHeight w:val="432" w:hRule="atLeast"/>
+          <w:trHeight w:val="360" w:hRule="atLeast"/>
         </w:trPr>
         <w:tc>
           <w:tcPr>
@@ -537,7 +537,7 @@
       </w:tr>
       <w:tr>
         <w:trPr>
-          <w:trHeight w:val="432" w:hRule="atLeast"/>
+          <w:trHeight w:val="1080" w:hRule="atLeast"/>
         </w:trPr>
         <w:tc>
           <w:tcPr>
@@ -598,7 +598,7 @@
       </w:tr>
       <w:tr>
         <w:trPr>
-          <w:trHeight w:val="432" w:hRule="atLeast"/>
+          <w:trHeight w:val="1080" w:hRule="atLeast"/>
         </w:trPr>
         <w:tc>
           <w:tcPr>
@@ -659,7 +659,7 @@
       </w:tr>
       <w:tr>
         <w:trPr>
-          <w:trHeight w:val="432" w:hRule="atLeast"/>
+          <w:trHeight w:val="360" w:hRule="atLeast"/>
         </w:trPr>
         <w:tc>
           <w:tcPr>
@@ -761,7 +761,7 @@
       <w:tr>
         <w:trPr>
           <w:tblHeader/>
-          <w:trHeight w:val="432" w:hRule="atLeast"/>
+          <w:trHeight w:val="360" w:hRule="atLeast"/>
         </w:trPr>
         <w:tc>
           <w:tcPr>
@@ -853,7 +853,7 @@
       </w:tr>
       <w:tr>
         <w:trPr>
-          <w:trHeight w:val="432" w:hRule="atLeast"/>
+          <w:trHeight w:val="1080" w:hRule="atLeast"/>
         </w:trPr>
         <w:tc>
           <w:tcPr>
@@ -942,7 +942,7 @@
       </w:tr>
       <w:tr>
         <w:trPr>
-          <w:trHeight w:val="432" w:hRule="atLeast"/>
+          <w:trHeight w:val="1080" w:hRule="atLeast"/>
         </w:trPr>
         <w:tc>
           <w:tcPr>
@@ -1031,7 +1031,7 @@
       </w:tr>
       <w:tr>
         <w:trPr>
-          <w:trHeight w:val="432" w:hRule="atLeast"/>
+          <w:trHeight w:val="1080" w:hRule="atLeast"/>
         </w:trPr>
         <w:tc>
           <w:tcPr>
@@ -1120,7 +1120,7 @@
       </w:tr>
       <w:tr>
         <w:trPr>
-          <w:trHeight w:val="432" w:hRule="atLeast"/>
+          <w:trHeight w:val="1080" w:hRule="atLeast"/>
         </w:trPr>
         <w:tc>
           <w:tcPr>
@@ -1209,7 +1209,7 @@
       </w:tr>
       <w:tr>
         <w:trPr>
-          <w:trHeight w:val="432" w:hRule="atLeast"/>
+          <w:trHeight w:val="1080" w:hRule="atLeast"/>
         </w:trPr>
         <w:tc>
           <w:tcPr>
@@ -1298,7 +1298,7 @@
       </w:tr>
       <w:tr>
         <w:trPr>
-          <w:trHeight w:val="432" w:hRule="atLeast"/>
+          <w:trHeight w:val="1080" w:hRule="atLeast"/>
         </w:trPr>
         <w:tc>
           <w:tcPr>
@@ -1387,7 +1387,7 @@
       </w:tr>
       <w:tr>
         <w:trPr>
-          <w:trHeight w:val="432" w:hRule="atLeast"/>
+          <w:trHeight w:val="1080" w:hRule="atLeast"/>
         </w:trPr>
         <w:tc>
           <w:tcPr>
@@ -1476,7 +1476,7 @@
       </w:tr>
       <w:tr>
         <w:trPr>
-          <w:trHeight w:val="432" w:hRule="atLeast"/>
+          <w:trHeight w:val="1080" w:hRule="atLeast"/>
         </w:trPr>
         <w:tc>
           <w:tcPr>
@@ -1644,7 +1644,7 @@
       <w:tr>
         <w:trPr>
           <w:tblHeader/>
-          <w:trHeight w:val="432" w:hRule="atLeast"/>
+          <w:trHeight w:val="360" w:hRule="atLeast"/>
         </w:trPr>
         <w:tc>
           <w:tcPr>
@@ -1736,7 +1736,7 @@
       </w:tr>
       <w:tr>
         <w:trPr>
-          <w:trHeight w:val="432" w:hRule="atLeast"/>
+          <w:trHeight w:val="1080" w:hRule="atLeast"/>
         </w:trPr>
         <w:tc>
           <w:tcPr>
@@ -1825,7 +1825,7 @@
       </w:tr>
       <w:tr>
         <w:trPr>
-          <w:trHeight w:val="432" w:hRule="atLeast"/>
+          <w:trHeight w:val="1080" w:hRule="atLeast"/>
         </w:trPr>
         <w:tc>
           <w:tcPr>
@@ -1914,7 +1914,7 @@
       </w:tr>
       <w:tr>
         <w:trPr>
-          <w:trHeight w:val="432" w:hRule="atLeast"/>
+          <w:trHeight w:val="1080" w:hRule="atLeast"/>
         </w:trPr>
         <w:tc>
           <w:tcPr>
@@ -2003,7 +2003,7 @@
       </w:tr>
       <w:tr>
         <w:trPr>
-          <w:trHeight w:val="432" w:hRule="atLeast"/>
+          <w:trHeight w:val="1440" w:hRule="atLeast"/>
         </w:trPr>
         <w:tc>
           <w:tcPr>
@@ -2092,7 +2092,7 @@
       </w:tr>
       <w:tr>
         <w:trPr>
-          <w:trHeight w:val="432" w:hRule="atLeast"/>
+          <w:trHeight w:val="1440" w:hRule="atLeast"/>
         </w:trPr>
         <w:tc>
           <w:tcPr>
@@ -2240,7 +2240,7 @@
       <w:tr>
         <w:trPr>
           <w:tblHeader/>
-          <w:trHeight w:val="432" w:hRule="atLeast"/>
+          <w:trHeight w:val="360" w:hRule="atLeast"/>
         </w:trPr>
         <w:tc>
           <w:tcPr>
@@ -2361,7 +2361,7 @@
       </w:tr>
       <w:tr>
         <w:trPr>
-          <w:trHeight w:val="432" w:hRule="atLeast"/>
+          <w:trHeight w:val="1440" w:hRule="atLeast"/>
         </w:trPr>
         <w:tc>
           <w:tcPr>
@@ -2478,7 +2478,7 @@
       </w:tr>
       <w:tr>
         <w:trPr>
-          <w:trHeight w:val="432" w:hRule="atLeast"/>
+          <w:trHeight w:val="1080" w:hRule="atLeast"/>
         </w:trPr>
         <w:tc>
           <w:tcPr>
@@ -2595,7 +2595,7 @@
       </w:tr>
       <w:tr>
         <w:trPr>
-          <w:trHeight w:val="432" w:hRule="atLeast"/>
+          <w:trHeight w:val="1080" w:hRule="atLeast"/>
         </w:trPr>
         <w:tc>
           <w:tcPr>
@@ -2794,7 +2794,7 @@
       <w:tr>
         <w:trPr>
           <w:tblHeader/>
-          <w:trHeight w:val="432" w:hRule="atLeast"/>
+          <w:trHeight w:val="360" w:hRule="atLeast"/>
         </w:trPr>
         <w:tc>
           <w:tcPr>
@@ -2973,7 +2973,7 @@
       </w:tr>
       <w:tr>
         <w:trPr>
-          <w:trHeight w:val="432" w:hRule="atLeast"/>
+          <w:trHeight w:val="1080" w:hRule="atLeast"/>
         </w:trPr>
         <w:tc>
           <w:tcPr>
@@ -3146,7 +3146,7 @@
       </w:tr>
       <w:tr>
         <w:trPr>
-          <w:trHeight w:val="432" w:hRule="atLeast"/>
+          <w:trHeight w:val="1080" w:hRule="atLeast"/>
         </w:trPr>
         <w:tc>
           <w:tcPr>
@@ -3319,7 +3319,7 @@
       </w:tr>
       <w:tr>
         <w:trPr>
-          <w:trHeight w:val="432" w:hRule="atLeast"/>
+          <w:trHeight w:val="360" w:hRule="atLeast"/>
         </w:trPr>
         <w:tc>
           <w:tcPr>
@@ -3492,7 +3492,7 @@
       </w:tr>
       <w:tr>
         <w:trPr>
-          <w:trHeight w:val="432" w:hRule="atLeast"/>
+          <w:trHeight w:val="360" w:hRule="atLeast"/>
         </w:trPr>
         <w:tc>
           <w:tcPr>
@@ -3665,7 +3665,7 @@
       </w:tr>
       <w:tr>
         <w:trPr>
-          <w:trHeight w:val="432" w:hRule="atLeast"/>
+          <w:trHeight w:val="1080" w:hRule="atLeast"/>
         </w:trPr>
         <w:tc>
           <w:tcPr>
@@ -3981,7 +3981,7 @@
       </w:tblGrid>
       <w:tr>
         <w:trPr>
-          <w:trHeight w:val="432" w:hRule="atLeast"/>
+          <w:trHeight w:val="1080" w:hRule="atLeast"/>
         </w:trPr>
         <w:tc>
           <w:tcPr>
@@ -4015,7 +4015,7 @@
       </w:tr>
       <w:tr>
         <w:trPr>
-          <w:trHeight w:val="432" w:hRule="atLeast"/>
+          <w:trHeight w:val="360" w:hRule="atLeast"/>
         </w:trPr>
         <w:tc>
           <w:tcPr>
@@ -4107,7 +4107,7 @@
       </w:tr>
       <w:tr>
         <w:trPr>
-          <w:trHeight w:val="432" w:hRule="atLeast"/>
+          <w:trHeight w:val="1440" w:hRule="atLeast"/>
         </w:trPr>
         <w:tc>
           <w:tcPr>
@@ -4679,7 +4679,7 @@
       </w:tr>
       <w:tr>
         <w:trPr>
-          <w:trHeight w:val="432" w:hRule="atLeast"/>
+          <w:trHeight w:val="360" w:hRule="atLeast"/>
         </w:trPr>
         <w:tc>
           <w:tcPr>
@@ -4712,7 +4712,7 @@
       </w:tr>
       <w:tr>
         <w:trPr>
-          <w:trHeight w:val="432" w:hRule="atLeast"/>
+          <w:trHeight w:val="360" w:hRule="atLeast"/>
         </w:trPr>
         <w:tc>
           <w:tcPr>
@@ -4804,7 +4804,7 @@
       </w:tr>
       <w:tr>
         <w:trPr>
-          <w:trHeight w:val="432" w:hRule="atLeast"/>
+          <w:trHeight w:val="1080" w:hRule="atLeast"/>
         </w:trPr>
         <w:tc>
           <w:tcPr>
@@ -4890,7 +4890,7 @@
       </w:tr>
       <w:tr>
         <w:trPr>
-          <w:trHeight w:val="432" w:hRule="atLeast"/>
+          <w:trHeight w:val="1080" w:hRule="atLeast"/>
         </w:trPr>
         <w:tc>
           <w:tcPr>
@@ -4976,7 +4976,7 @@
       </w:tr>
       <w:tr>
         <w:trPr>
-          <w:trHeight w:val="432" w:hRule="atLeast"/>
+          <w:trHeight w:val="1080" w:hRule="atLeast"/>
         </w:trPr>
         <w:tc>
           <w:tcPr>
@@ -5062,7 +5062,7 @@
       </w:tr>
       <w:tr>
         <w:trPr>
-          <w:trHeight w:val="432" w:hRule="atLeast"/>
+          <w:trHeight w:val="1080" w:hRule="atLeast"/>
         </w:trPr>
         <w:tc>
           <w:tcPr>
@@ -5148,7 +5148,7 @@
       </w:tr>
       <w:tr>
         <w:trPr>
-          <w:trHeight w:val="432" w:hRule="atLeast"/>
+          <w:trHeight w:val="1080" w:hRule="atLeast"/>
         </w:trPr>
         <w:tc>
           <w:tcPr>
@@ -5234,7 +5234,7 @@
       </w:tr>
       <w:tr>
         <w:trPr>
-          <w:trHeight w:val="432" w:hRule="atLeast"/>
+          <w:trHeight w:val="1080" w:hRule="atLeast"/>
         </w:trPr>
         <w:tc>
           <w:tcPr>
@@ -5520,7 +5520,7 @@
       <w:tr>
         <w:trPr>
           <w:tblHeader/>
-          <w:trHeight w:val="432" w:hRule="atLeast"/>
+          <w:trHeight w:val="360" w:hRule="atLeast"/>
         </w:trPr>
         <w:tc>
           <w:tcPr>
@@ -5612,7 +5612,7 @@
       </w:tr>
       <w:tr>
         <w:trPr>
-          <w:trHeight w:val="432" w:hRule="atLeast"/>
+          <w:trHeight w:val="360" w:hRule="atLeast"/>
         </w:trPr>
         <w:tc>
           <w:tcPr>
@@ -5701,7 +5701,7 @@
       </w:tr>
       <w:tr>
         <w:trPr>
-          <w:trHeight w:val="432" w:hRule="atLeast"/>
+          <w:trHeight w:val="1080" w:hRule="atLeast"/>
         </w:trPr>
         <w:tc>
           <w:tcPr>
@@ -5790,7 +5790,7 @@
       </w:tr>
       <w:tr>
         <w:trPr>
-          <w:trHeight w:val="432" w:hRule="atLeast"/>
+          <w:trHeight w:val="1080" w:hRule="atLeast"/>
         </w:trPr>
         <w:tc>
           <w:tcPr>
@@ -5879,7 +5879,7 @@
       </w:tr>
       <w:tr>
         <w:trPr>
-          <w:trHeight w:val="432" w:hRule="atLeast"/>
+          <w:trHeight w:val="1080" w:hRule="atLeast"/>
         </w:trPr>
         <w:tc>
           <w:tcPr>
@@ -5968,7 +5968,7 @@
       </w:tr>
       <w:tr>
         <w:trPr>
-          <w:trHeight w:val="432" w:hRule="atLeast"/>
+          <w:trHeight w:val="1080" w:hRule="atLeast"/>
         </w:trPr>
         <w:tc>
           <w:tcPr>
@@ -6057,7 +6057,7 @@
       </w:tr>
       <w:tr>
         <w:trPr>
-          <w:trHeight w:val="432" w:hRule="atLeast"/>
+          <w:trHeight w:val="1080" w:hRule="atLeast"/>
         </w:trPr>
         <w:tc>
           <w:tcPr>
@@ -6146,7 +6146,7 @@
       </w:tr>
       <w:tr>
         <w:trPr>
-          <w:trHeight w:val="432" w:hRule="atLeast"/>
+          <w:trHeight w:val="1080" w:hRule="atLeast"/>
         </w:trPr>
         <w:tc>
           <w:tcPr>
@@ -6235,7 +6235,7 @@
       </w:tr>
       <w:tr>
         <w:trPr>
-          <w:trHeight w:val="432" w:hRule="atLeast"/>
+          <w:trHeight w:val="1080" w:hRule="atLeast"/>
         </w:trPr>
         <w:tc>
           <w:tcPr>
@@ -6324,7 +6324,7 @@
       </w:tr>
       <w:tr>
         <w:trPr>
-          <w:trHeight w:val="432" w:hRule="atLeast"/>
+          <w:trHeight w:val="1080" w:hRule="atLeast"/>
         </w:trPr>
         <w:tc>
           <w:tcPr>
@@ -6413,7 +6413,7 @@
       </w:tr>
       <w:tr>
         <w:trPr>
-          <w:trHeight w:val="432" w:hRule="atLeast"/>
+          <w:trHeight w:val="1080" w:hRule="atLeast"/>
         </w:trPr>
         <w:tc>
           <w:tcPr>
@@ -6542,7 +6542,7 @@
       <w:tr>
         <w:trPr>
           <w:tblHeader/>
-          <w:trHeight w:val="432" w:hRule="atLeast"/>
+          <w:trHeight w:val="360" w:hRule="atLeast"/>
         </w:trPr>
         <w:tc>
           <w:tcPr>
@@ -6605,7 +6605,7 @@
       </w:tr>
       <w:tr>
         <w:trPr>
-          <w:trHeight w:val="432" w:hRule="atLeast"/>
+          <w:trHeight w:val="360" w:hRule="atLeast"/>
         </w:trPr>
         <w:tc>
           <w:tcPr>
@@ -6666,7 +6666,7 @@
       </w:tr>
       <w:tr>
         <w:trPr>
-          <w:trHeight w:val="432" w:hRule="atLeast"/>
+          <w:trHeight w:val="1080" w:hRule="atLeast"/>
         </w:trPr>
         <w:tc>
           <w:tcPr>
@@ -6727,7 +6727,7 @@
       </w:tr>
       <w:tr>
         <w:trPr>
-          <w:trHeight w:val="432" w:hRule="atLeast"/>
+          <w:trHeight w:val="360" w:hRule="atLeast"/>
         </w:trPr>
         <w:tc>
           <w:tcPr>
@@ -6788,7 +6788,7 @@
       </w:tr>
       <w:tr>
         <w:trPr>
-          <w:trHeight w:val="432" w:hRule="atLeast"/>
+          <w:trHeight w:val="360" w:hRule="atLeast"/>
         </w:trPr>
         <w:tc>
           <w:tcPr>
@@ -6849,7 +6849,7 @@
       </w:tr>
       <w:tr>
         <w:trPr>
-          <w:trHeight w:val="432" w:hRule="atLeast"/>
+          <w:trHeight w:val="360" w:hRule="atLeast"/>
         </w:trPr>
         <w:tc>
           <w:tcPr>
@@ -6910,7 +6910,7 @@
       </w:tr>
       <w:tr>
         <w:trPr>
-          <w:trHeight w:val="432" w:hRule="atLeast"/>
+          <w:trHeight w:val="1080" w:hRule="atLeast"/>
         </w:trPr>
         <w:tc>
           <w:tcPr>
@@ -6971,7 +6971,7 @@
       </w:tr>
       <w:tr>
         <w:trPr>
-          <w:trHeight w:val="432" w:hRule="atLeast"/>
+          <w:trHeight w:val="1080" w:hRule="atLeast"/>
         </w:trPr>
         <w:tc>
           <w:tcPr>
@@ -7032,7 +7032,7 @@
       </w:tr>
       <w:tr>
         <w:trPr>
-          <w:trHeight w:val="432" w:hRule="atLeast"/>
+          <w:trHeight w:val="1080" w:hRule="atLeast"/>
         </w:trPr>
         <w:tc>
           <w:tcPr>
@@ -7156,7 +7156,7 @@
       <w:tr>
         <w:trPr>
           <w:tblHeader/>
-          <w:trHeight w:val="432" w:hRule="atLeast"/>
+          <w:trHeight w:val="360" w:hRule="atLeast"/>
         </w:trPr>
         <w:tc>
           <w:tcPr>
@@ -7277,7 +7277,7 @@
       </w:tr>
       <w:tr>
         <w:trPr>
-          <w:trHeight w:val="432" w:hRule="atLeast"/>
+          <w:trHeight w:val="360" w:hRule="atLeast"/>
         </w:trPr>
         <w:tc>
           <w:tcPr>
@@ -7394,7 +7394,7 @@
       </w:tr>
       <w:tr>
         <w:trPr>
-          <w:trHeight w:val="432" w:hRule="atLeast"/>
+          <w:trHeight w:val="360" w:hRule="atLeast"/>
         </w:trPr>
         <w:tc>
           <w:tcPr>
@@ -7511,7 +7511,7 @@
       </w:tr>
       <w:tr>
         <w:trPr>
-          <w:trHeight w:val="432" w:hRule="atLeast"/>
+          <w:trHeight w:val="1080" w:hRule="atLeast"/>
         </w:trPr>
         <w:tc>
           <w:tcPr>
@@ -7628,7 +7628,7 @@
       </w:tr>
       <w:tr>
         <w:trPr>
-          <w:trHeight w:val="432" w:hRule="atLeast"/>
+          <w:trHeight w:val="360" w:hRule="atLeast"/>
         </w:trPr>
         <w:tc>
           <w:tcPr>
@@ -7745,7 +7745,7 @@
       </w:tr>
       <w:tr>
         <w:trPr>
-          <w:trHeight w:val="432" w:hRule="atLeast"/>
+          <w:trHeight w:val="1080" w:hRule="atLeast"/>
         </w:trPr>
         <w:tc>
           <w:tcPr>
@@ -7862,7 +7862,7 @@
       </w:tr>
       <w:tr>
         <w:trPr>
-          <w:trHeight w:val="432" w:hRule="atLeast"/>
+          <w:trHeight w:val="1080" w:hRule="atLeast"/>
         </w:trPr>
         <w:tc>
           <w:tcPr>
@@ -8147,7 +8147,7 @@
       <w:tr>
         <w:trPr>
           <w:tblHeader/>
-          <w:trHeight w:val="432" w:hRule="atLeast"/>
+          <w:trHeight w:val="360" w:hRule="atLeast"/>
         </w:trPr>
         <w:tc>
           <w:tcPr>
@@ -8268,7 +8268,7 @@
       </w:tr>
       <w:tr>
         <w:trPr>
-          <w:trHeight w:val="432" w:hRule="atLeast"/>
+          <w:trHeight w:val="1080" w:hRule="atLeast"/>
         </w:trPr>
         <w:tc>
           <w:tcPr>
@@ -8385,7 +8385,7 @@
       </w:tr>
       <w:tr>
         <w:trPr>
-          <w:trHeight w:val="432" w:hRule="atLeast"/>
+          <w:trHeight w:val="360" w:hRule="atLeast"/>
         </w:trPr>
         <w:tc>
           <w:tcPr>
@@ -8502,7 +8502,7 @@
       </w:tr>
       <w:tr>
         <w:trPr>
-          <w:trHeight w:val="432" w:hRule="atLeast"/>
+          <w:trHeight w:val="1080" w:hRule="atLeast"/>
         </w:trPr>
         <w:tc>
           <w:tcPr>
@@ -8619,7 +8619,7 @@
       </w:tr>
       <w:tr>
         <w:trPr>
-          <w:trHeight w:val="432" w:hRule="atLeast"/>
+          <w:trHeight w:val="1080" w:hRule="atLeast"/>
         </w:trPr>
         <w:tc>
           <w:tcPr>
@@ -8736,7 +8736,7 @@
       </w:tr>
       <w:tr>
         <w:trPr>
-          <w:trHeight w:val="432" w:hRule="atLeast"/>
+          <w:trHeight w:val="1080" w:hRule="atLeast"/>
         </w:trPr>
         <w:tc>
           <w:tcPr>
@@ -8912,7 +8912,7 @@
       <w:tr>
         <w:trPr>
           <w:tblHeader/>
-          <w:trHeight w:val="432" w:hRule="atLeast"/>
+          <w:trHeight w:val="360" w:hRule="atLeast"/>
         </w:trPr>
         <w:tc>
           <w:tcPr>
@@ -9033,7 +9033,7 @@
       </w:tr>
       <w:tr>
         <w:trPr>
-          <w:trHeight w:val="432" w:hRule="atLeast"/>
+          <w:trHeight w:val="360" w:hRule="atLeast"/>
         </w:trPr>
         <w:tc>
           <w:tcPr>
@@ -9150,7 +9150,7 @@
       </w:tr>
       <w:tr>
         <w:trPr>
-          <w:trHeight w:val="432" w:hRule="atLeast"/>
+          <w:trHeight w:val="360" w:hRule="atLeast"/>
         </w:trPr>
         <w:tc>
           <w:tcPr>
@@ -9267,7 +9267,7 @@
       </w:tr>
       <w:tr>
         <w:trPr>
-          <w:trHeight w:val="432" w:hRule="atLeast"/>
+          <w:trHeight w:val="360" w:hRule="atLeast"/>
         </w:trPr>
         <w:tc>
           <w:tcPr>
@@ -9384,7 +9384,7 @@
       </w:tr>
       <w:tr>
         <w:trPr>
-          <w:trHeight w:val="432" w:hRule="atLeast"/>
+          <w:trHeight w:val="360" w:hRule="atLeast"/>
         </w:trPr>
         <w:tc>
           <w:tcPr>
@@ -9501,7 +9501,7 @@
       </w:tr>
       <w:tr>
         <w:trPr>
-          <w:trHeight w:val="432" w:hRule="atLeast"/>
+          <w:trHeight w:val="360" w:hRule="atLeast"/>
         </w:trPr>
         <w:tc>
           <w:tcPr>
@@ -9618,7 +9618,7 @@
       </w:tr>
       <w:tr>
         <w:trPr>
-          <w:trHeight w:val="432" w:hRule="atLeast"/>
+          <w:trHeight w:val="360" w:hRule="atLeast"/>
         </w:trPr>
         <w:tc>
           <w:tcPr>
@@ -9735,7 +9735,7 @@
       </w:tr>
       <w:tr>
         <w:trPr>
-          <w:trHeight w:val="432" w:hRule="atLeast"/>
+          <w:trHeight w:val="360" w:hRule="atLeast"/>
         </w:trPr>
         <w:tc>
           <w:tcPr>
@@ -9852,7 +9852,7 @@
       </w:tr>
       <w:tr>
         <w:trPr>
-          <w:trHeight w:val="432" w:hRule="atLeast"/>
+          <w:trHeight w:val="360" w:hRule="atLeast"/>
         </w:trPr>
         <w:tc>
           <w:tcPr>
@@ -9969,7 +9969,7 @@
       </w:tr>
       <w:tr>
         <w:trPr>
-          <w:trHeight w:val="432" w:hRule="atLeast"/>
+          <w:trHeight w:val="360" w:hRule="atLeast"/>
         </w:trPr>
         <w:tc>
           <w:tcPr>
@@ -10086,7 +10086,7 @@
       </w:tr>
       <w:tr>
         <w:trPr>
-          <w:trHeight w:val="432" w:hRule="atLeast"/>
+          <w:trHeight w:val="360" w:hRule="atLeast"/>
         </w:trPr>
         <w:tc>
           <w:tcPr>
@@ -10203,7 +10203,7 @@
       </w:tr>
       <w:tr>
         <w:trPr>
-          <w:trHeight w:val="432" w:hRule="atLeast"/>
+          <w:trHeight w:val="360" w:hRule="atLeast"/>
         </w:trPr>
         <w:tc>
           <w:tcPr>
@@ -10320,7 +10320,7 @@
       </w:tr>
       <w:tr>
         <w:trPr>
-          <w:trHeight w:val="432" w:hRule="atLeast"/>
+          <w:trHeight w:val="360" w:hRule="atLeast"/>
         </w:trPr>
         <w:tc>
           <w:tcPr>
@@ -10437,7 +10437,7 @@
       </w:tr>
       <w:tr>
         <w:trPr>
-          <w:trHeight w:val="432" w:hRule="atLeast"/>
+          <w:trHeight w:val="360" w:hRule="atLeast"/>
         </w:trPr>
         <w:tc>
           <w:tcPr>
@@ -10554,7 +10554,7 @@
       </w:tr>
       <w:tr>
         <w:trPr>
-          <w:trHeight w:val="432" w:hRule="atLeast"/>
+          <w:trHeight w:val="360" w:hRule="atLeast"/>
         </w:trPr>
         <w:tc>
           <w:tcPr>
@@ -10671,7 +10671,7 @@
       </w:tr>
       <w:tr>
         <w:trPr>
-          <w:trHeight w:val="432" w:hRule="atLeast"/>
+          <w:trHeight w:val="360" w:hRule="atLeast"/>
         </w:trPr>
         <w:tc>
           <w:tcPr>
@@ -10788,7 +10788,7 @@
       </w:tr>
       <w:tr>
         <w:trPr>
-          <w:trHeight w:val="432" w:hRule="atLeast"/>
+          <w:trHeight w:val="360" w:hRule="atLeast"/>
         </w:trPr>
         <w:tc>
           <w:tcPr>
@@ -10905,7 +10905,7 @@
       </w:tr>
       <w:tr>
         <w:trPr>
-          <w:trHeight w:val="432" w:hRule="atLeast"/>
+          <w:trHeight w:val="360" w:hRule="atLeast"/>
         </w:trPr>
         <w:tc>
           <w:tcPr>
@@ -11419,7 +11419,7 @@
       <w:tr>
         <w:trPr>
           <w:tblHeader/>
-          <w:trHeight w:val="432" w:hRule="atLeast"/>
+          <w:trHeight w:val="360" w:hRule="atLeast"/>
         </w:trPr>
         <w:tc>
           <w:tcPr>
@@ -11540,7 +11540,7 @@
       </w:tr>
       <w:tr>
         <w:trPr>
-          <w:trHeight w:val="432" w:hRule="atLeast"/>
+          <w:trHeight w:val="1440" w:hRule="atLeast"/>
         </w:trPr>
         <w:tc>
           <w:tcPr>
@@ -11657,7 +11657,7 @@
       </w:tr>
       <w:tr>
         <w:trPr>
-          <w:trHeight w:val="432" w:hRule="atLeast"/>
+          <w:trHeight w:val="1440" w:hRule="atLeast"/>
         </w:trPr>
         <w:tc>
           <w:tcPr>
@@ -11774,7 +11774,7 @@
       </w:tr>
       <w:tr>
         <w:trPr>
-          <w:trHeight w:val="432" w:hRule="atLeast"/>
+          <w:trHeight w:val="1440" w:hRule="atLeast"/>
         </w:trPr>
         <w:tc>
           <w:tcPr>
@@ -11891,7 +11891,7 @@
       </w:tr>
       <w:tr>
         <w:trPr>
-          <w:trHeight w:val="432" w:hRule="atLeast"/>
+          <w:trHeight w:val="1440" w:hRule="atLeast"/>
         </w:trPr>
         <w:tc>
           <w:tcPr>
@@ -12008,7 +12008,7 @@
       </w:tr>
       <w:tr>
         <w:trPr>
-          <w:trHeight w:val="432" w:hRule="atLeast"/>
+          <w:trHeight w:val="1440" w:hRule="atLeast"/>
         </w:trPr>
         <w:tc>
           <w:tcPr>
@@ -12125,7 +12125,7 @@
       </w:tr>
       <w:tr>
         <w:trPr>
-          <w:trHeight w:val="432" w:hRule="atLeast"/>
+          <w:trHeight w:val="1440" w:hRule="atLeast"/>
         </w:trPr>
         <w:tc>
           <w:tcPr>
@@ -12321,7 +12321,7 @@
       <w:tr>
         <w:trPr>
           <w:tblHeader/>
-          <w:trHeight w:val="432" w:hRule="atLeast"/>
+          <w:trHeight w:val="360" w:hRule="atLeast"/>
         </w:trPr>
         <w:tc>
           <w:tcPr>
@@ -12413,7 +12413,7 @@
       </w:tr>
       <w:tr>
         <w:trPr>
-          <w:trHeight w:val="432" w:hRule="atLeast"/>
+          <w:trHeight w:val="1080" w:hRule="atLeast"/>
         </w:trPr>
         <w:tc>
           <w:tcPr>
@@ -12502,7 +12502,7 @@
       </w:tr>
       <w:tr>
         <w:trPr>
-          <w:trHeight w:val="432" w:hRule="atLeast"/>
+          <w:trHeight w:val="1080" w:hRule="atLeast"/>
         </w:trPr>
         <w:tc>
           <w:tcPr>
@@ -12591,7 +12591,7 @@
       </w:tr>
       <w:tr>
         <w:trPr>
-          <w:trHeight w:val="432" w:hRule="atLeast"/>
+          <w:trHeight w:val="1080" w:hRule="atLeast"/>
         </w:trPr>
         <w:tc>
           <w:tcPr>
@@ -12680,7 +12680,7 @@
       </w:tr>
       <w:tr>
         <w:trPr>
-          <w:trHeight w:val="432" w:hRule="atLeast"/>
+          <w:trHeight w:val="1080" w:hRule="atLeast"/>
         </w:trPr>
         <w:tc>
           <w:tcPr>
@@ -12769,7 +12769,7 @@
       </w:tr>
       <w:tr>
         <w:trPr>
-          <w:trHeight w:val="432" w:hRule="atLeast"/>
+          <w:trHeight w:val="1080" w:hRule="atLeast"/>
         </w:trPr>
         <w:tc>
           <w:tcPr>
@@ -12918,7 +12918,7 @@
       <w:tr>
         <w:trPr>
           <w:tblHeader/>
-          <w:trHeight w:val="432" w:hRule="atLeast"/>
+          <w:trHeight w:val="360" w:hRule="atLeast"/>
         </w:trPr>
         <w:tc>
           <w:tcPr>
@@ -13068,7 +13068,7 @@
       </w:tr>
       <w:tr>
         <w:trPr>
-          <w:trHeight w:val="432" w:hRule="atLeast"/>
+          <w:trHeight w:val="1440" w:hRule="atLeast"/>
         </w:trPr>
         <w:tc>
           <w:tcPr>
@@ -13213,7 +13213,7 @@
       </w:tr>
       <w:tr>
         <w:trPr>
-          <w:trHeight w:val="432" w:hRule="atLeast"/>
+          <w:trHeight w:val="1440" w:hRule="atLeast"/>
         </w:trPr>
         <w:tc>
           <w:tcPr>
@@ -13358,7 +13358,7 @@
       </w:tr>
       <w:tr>
         <w:trPr>
-          <w:trHeight w:val="432" w:hRule="atLeast"/>
+          <w:trHeight w:val="1080" w:hRule="atLeast"/>
         </w:trPr>
         <w:tc>
           <w:tcPr>
@@ -13503,7 +13503,7 @@
       </w:tr>
       <w:tr>
         <w:trPr>
-          <w:trHeight w:val="432" w:hRule="atLeast"/>
+          <w:trHeight w:val="1440" w:hRule="atLeast"/>
         </w:trPr>
         <w:tc>
           <w:tcPr>
@@ -13648,7 +13648,7 @@
       </w:tr>
       <w:tr>
         <w:trPr>
-          <w:trHeight w:val="432" w:hRule="atLeast"/>
+          <w:trHeight w:val="1440" w:hRule="atLeast"/>
         </w:trPr>
         <w:tc>
           <w:tcPr>
@@ -13793,7 +13793,7 @@
       </w:tr>
       <w:tr>
         <w:trPr>
-          <w:trHeight w:val="432" w:hRule="atLeast"/>
+          <w:trHeight w:val="1440" w:hRule="atLeast"/>
         </w:trPr>
         <w:tc>
           <w:tcPr>
@@ -13938,7 +13938,7 @@
       </w:tr>
       <w:tr>
         <w:trPr>
-          <w:trHeight w:val="432" w:hRule="atLeast"/>
+          <w:trHeight w:val="1440" w:hRule="atLeast"/>
         </w:trPr>
         <w:tc>
           <w:tcPr>
@@ -14083,7 +14083,7 @@
       </w:tr>
       <w:tr>
         <w:trPr>
-          <w:trHeight w:val="432" w:hRule="atLeast"/>
+          <w:trHeight w:val="1440" w:hRule="atLeast"/>
         </w:trPr>
         <w:tc>
           <w:tcPr>
@@ -14228,7 +14228,7 @@
       </w:tr>
       <w:tr>
         <w:trPr>
-          <w:trHeight w:val="432" w:hRule="atLeast"/>
+          <w:trHeight w:val="1440" w:hRule="atLeast"/>
         </w:trPr>
         <w:tc>
           <w:tcPr>
@@ -14373,7 +14373,7 @@
       </w:tr>
       <w:tr>
         <w:trPr>
-          <w:trHeight w:val="432" w:hRule="atLeast"/>
+          <w:trHeight w:val="1440" w:hRule="atLeast"/>
         </w:trPr>
         <w:tc>
           <w:tcPr>
@@ -14518,7 +14518,7 @@
       </w:tr>
       <w:tr>
         <w:trPr>
-          <w:trHeight w:val="432" w:hRule="atLeast"/>
+          <w:trHeight w:val="1440" w:hRule="atLeast"/>
         </w:trPr>
         <w:tc>
           <w:tcPr>
@@ -14705,7 +14705,7 @@
       <w:tr>
         <w:trPr>
           <w:tblHeader/>
-          <w:trHeight w:val="432" w:hRule="atLeast"/>
+          <w:trHeight w:val="360" w:hRule="atLeast"/>
         </w:trPr>
         <w:tc>
           <w:tcPr>
@@ -14826,7 +14826,7 @@
       </w:tr>
       <w:tr>
         <w:trPr>
-          <w:trHeight w:val="432" w:hRule="atLeast"/>
+          <w:trHeight w:val="1440" w:hRule="atLeast"/>
         </w:trPr>
         <w:tc>
           <w:tcPr>
@@ -14937,6 +14937,123 @@
                 <w:szCs w:val="20"/>
               </w:rPr>
               <w:t xml:space="preserve">Initial draft. Incorporates customer requirements and engineering team first-pass feedback: indicator light grade states and flash logic; 6-week timeline with PE trial in Wk 4; photosensor as default trigger with 3 options; image capture policy (full-frame on fail for DMST upload); remote access approach; flat-file event log requirement; open items list.</w:t>
+            </w:r>
+          </w:p>
+        </w:tc>
+      </w:tr>
+      <w:tr>
+        <w:trPr>
+          <w:trHeight w:val="1440" w:hRule="atLeast"/>
+        </w:trPr>
+        <w:tc>
+          <w:tcPr>
+            <w:tcW w:type="pct" w:w="10%"/>
+            <w:tcBorders>
+              <w:top w:val="single" w:color="D9D9D9" w:sz="4"/>
+              <w:left w:val="single" w:color="D9D9D9" w:sz="4"/>
+              <w:bottom w:val="single" w:color="D9D9D9" w:sz="4"/>
+              <w:right w:val="single" w:color="D9D9D9" w:sz="4"/>
+            </w:tcBorders>
+            <w:shd w:fill="FFFFFF" w:val="clear"/>
+            <w:vAlign w:val="center"/>
+          </w:tcPr>
+          <w:p>
+            <w:pPr>
+              <w:spacing w:after="6" w:before="6"/>
+            </w:pPr>
+            <w:r>
+              <w:rPr>
+                <w:b w:val="false"/>
+                <w:bCs w:val="false"/>
+                <w:color w:val="000000"/>
+                <w:sz w:val="20"/>
+                <w:szCs w:val="20"/>
+              </w:rPr>
+              <w:t>1.1</w:t>
+            </w:r>
+          </w:p>
+        </w:tc>
+        <w:tc>
+          <w:tcPr>
+            <w:tcW w:type="pct" w:w="14%"/>
+            <w:tcBorders>
+              <w:top w:val="single" w:color="D9D9D9" w:sz="4"/>
+              <w:left w:val="single" w:color="D9D9D9" w:sz="4"/>
+              <w:bottom w:val="single" w:color="D9D9D9" w:sz="4"/>
+              <w:right w:val="single" w:color="D9D9D9" w:sz="4"/>
+            </w:tcBorders>
+            <w:shd w:fill="FFFFFF" w:val="clear"/>
+            <w:vAlign w:val="center"/>
+          </w:tcPr>
+          <w:p>
+            <w:pPr>
+              <w:spacing w:after="6" w:before="6"/>
+            </w:pPr>
+            <w:r>
+              <w:rPr>
+                <w:b w:val="false"/>
+                <w:bCs w:val="false"/>
+                <w:color w:val="000000"/>
+                <w:sz w:val="20"/>
+                <w:szCs w:val="20"/>
+              </w:rPr>
+              <w:t>4 August 2026</w:t>
+            </w:r>
+          </w:p>
+        </w:tc>
+        <w:tc>
+          <w:tcPr>
+            <w:tcW w:type="pct" w:w="20%"/>
+            <w:tcBorders>
+              <w:top w:val="single" w:color="D9D9D9" w:sz="4"/>
+              <w:left w:val="single" w:color="D9D9D9" w:sz="4"/>
+              <w:bottom w:val="single" w:color="D9D9D9" w:sz="4"/>
+              <w:right w:val="single" w:color="D9D9D9" w:sz="4"/>
+            </w:tcBorders>
+            <w:shd w:fill="FFFFFF" w:val="clear"/>
+            <w:vAlign w:val="center"/>
+          </w:tcPr>
+          <w:p>
+            <w:pPr>
+              <w:spacing w:after="6" w:before="6"/>
+            </w:pPr>
+            <w:r>
+              <w:rPr>
+                <w:b w:val="false"/>
+                <w:bCs w:val="false"/>
+                <w:color w:val="000000"/>
+                <w:sz w:val="20"/>
+                <w:szCs w:val="20"/>
+              </w:rPr>
+              <w:t>VCCS/PIPS / Engineering</w:t>
+            </w:r>
+          </w:p>
+        </w:tc>
+        <w:tc>
+          <w:tcPr>
+            <w:tcW w:type="pct" w:w="56%"/>
+            <w:tcBorders>
+              <w:top w:val="single" w:color="D9D9D9" w:sz="4"/>
+              <w:left w:val="single" w:color="D9D9D9" w:sz="4"/>
+              <w:bottom w:val="single" w:color="D9D9D9" w:sz="4"/>
+              <w:right w:val="single" w:color="D9D9D9" w:sz="4"/>
+            </w:tcBorders>
+            <w:shd w:fill="FFFFFF" w:val="clear"/>
+            <w:vAlign w:val="center"/>
+          </w:tcPr>
+          <w:p>
+            <w:pPr>
+              <w:spacing w:after="6" w:before="6"/>
+            </w:pPr>
+            <w:r>
+              <w:rPr>
+                <w:b w:val="false"/>
+                <w:bCs w:val="false"/>
+                <w:color w:val="000000"/>
+                <w:sz w:val="20"/>
+                <w:szCs w:val="20"/>
+              </w:rPr>
+              <w:t>Applied proportional row heights (Option B); updated terminology CP Inline → Command Pilot Inline throughout.</w:t>
             </w:r>
           </w:p>
         </w:tc>

</xml_diff>